<commit_message>
Fix test bug rate rounding, pin the mined snapshot and polish docs
</commit_message>
<xml_diff>
--- a/docs/Project_Report.docx
+++ b/docs/Project_Report.docx
@@ -2,7 +2,7 @@
 <file path=word/document.xml><?xml version="1.0" encoding="utf-8"?>
 <w:document xmlns:w="http://schemas.openxmlformats.org/wordprocessingml/2006/main" xmlns:m="http://schemas.openxmlformats.org/officeDocument/2006/math" xmlns:r="http://schemas.openxmlformats.org/officeDocument/2006/relationships" xmlns:o="urn:schemas-microsoft-com:office:office" xmlns:v="urn:schemas-microsoft-com:vml" xmlns:w10="urn:schemas-microsoft-com:office:word" xmlns:a="http://schemas.openxmlformats.org/drawingml/2006/main" xmlns:pic="http://schemas.openxmlformats.org/drawingml/2006/picture" xmlns:wp="http://schemas.openxmlformats.org/drawingml/2006/wordprocessingDrawing">
   <w:body>
-    <w:bookmarkStart w:id="99" w:name="X7c8a9173058198f46d66c8517304e0e9ddff43f"/>
+    <w:bookmarkStart w:id="105" w:name="X7c8a9173058198f46d66c8517304e0e9ddff43f"/>
     <w:p>
       <w:pPr>
         <w:pStyle w:val="Heading1"/>
@@ -105,7 +105,7 @@
         <w:pStyle w:val="BodyText"/>
       </w:pPr>
       <w:r>
-        <w:t xml:space="preserve">A tuned XGBoost model, chosen by cross-validation on the training period, reached a test ROC-AUC of 0.779 and a PR-AUC of 0.401 (random guessing gets 0.150). If reviewers only look at the 20% of commits it ranks riskiest, they find 48% of all bug-introducing commits. SHAP and LIME turn each prediction into a short list of reasons, and a Streamlit app lets a reviewer score any commit, read why it is risky and try out changes (for example, splitting a large commit) to see how the risk would drop.</w:t>
+        <w:t xml:space="preserve">A tuned XGBoost model, chosen by cross-validation on the training period, reached a test ROC-AUC of 0.779 and a PR-AUC of 0.401 (random guessing gets 0.151). If reviewers only look at the 20% of commits it ranks riskiest, they find 48% of all bug-introducing commits. SHAP and LIME turn each prediction into a short list of reasons, and a Streamlit app lets a reviewer score any commit, read why it is risky and try out changes (for example, splitting a large commit) to see how the risk would drop.</w:t>
       </w:r>
     </w:p>
     <w:p>
@@ -825,7 +825,22 @@
         <w:t xml:space="preserve">psf/requests</w:t>
       </w:r>
       <w:r>
-        <w:t xml:space="preserve">, a widely used Python HTTP library that has been active since 2011. We only kept non-merge commits that change source code. Commits that only touch documentation were skipped.</w:t>
+        <w:t xml:space="preserve">, a widely used Python HTTP library that has been active since 2011. We used the repository as it stood at commit</w:t>
+      </w:r>
+      <w:r>
+        <w:t xml:space="preserve"> </w:t>
+      </w:r>
+      <w:r>
+        <w:rPr>
+          <w:rStyle w:val="VerbatimChar"/>
+        </w:rPr>
+        <w:t xml:space="preserve">611c616</w:t>
+      </w:r>
+      <w:r>
+        <w:t xml:space="preserve"> </w:t>
+      </w:r>
+      <w:r>
+        <w:t xml:space="preserve">(21 September 2026), so the dataset can be rebuilt exactly. We only kept non-merge commits that change source code. Commits that only touch documentation were skipped.</w:t>
       </w:r>
     </w:p>
     <w:tbl>
@@ -3378,7 +3393,7 @@
               <w:pStyle w:val="Compact"/>
             </w:pPr>
             <w:r>
-              <w:t xml:space="preserve">15.0%</w:t>
+              <w:t xml:space="preserve">15.1%</w:t>
             </w:r>
           </w:p>
         </w:tc>
@@ -4507,7 +4522,7 @@
               <w:pStyle w:val="Compact"/>
             </w:pPr>
             <w:r>
-              <w:t xml:space="preserve">Decision Tree (ID3 style, entropy)</w:t>
+              <w:t xml:space="preserve">Decision Tree (CART, entropy)</w:t>
             </w:r>
           </w:p>
         </w:tc>
@@ -5008,7 +5023,7 @@
         <w:pStyle w:val="BodyText"/>
       </w:pPr>
       <w:r>
-        <w:t xml:space="preserve">Single decision trees and the perceptron are clearly weaker and less stable. The trees overfit easily, and the perceptron doesn't produce useful probabilities.</w:t>
+        <w:t xml:space="preserve">Single decision trees and the perceptron are clearly weaker and less stable. The trees overfit easily, and the perceptron doesn't produce useful probabilities. One note on naming: the entropy tree uses the same information gain idea as ID3, but scikit-learn always builds binary splits like CART, so it is a CART tree with the entropy criterion rather than a true ID3 tree.</w:t>
       </w:r>
     </w:p>
     <w:p>
@@ -5024,7 +5039,7 @@
         <w:pStyle w:val="BodyText"/>
       </w:pPr>
       <w:r>
-        <w:t xml:space="preserve">Most models actually score higher on the test set than in cross-validation, even though the test bug rate is lower (15.0% against 23.6%). The later history of</w:t>
+        <w:t xml:space="preserve">Most models actually score higher on the test set than in cross-validation, even though the test bug rate is lower (15.1% against 23.6%). The later history of</w:t>
       </w:r>
       <w:r>
         <w:t xml:space="preserve"> </w:t>
@@ -5039,7 +5054,7 @@
         <w:t xml:space="preserve"> </w:t>
       </w:r>
       <w:r>
-        <w:t xml:space="preserve">is calmer, and its big risky commits are easier to spot. Keep in mind that PR-AUC should be compared with the test bug rate of 0.150, not with 0.5.</w:t>
+        <w:t xml:space="preserve">is calmer, and its big risky commits are easier to spot. Keep in mind that PR-AUC should be compared with the test bug rate of 0.151, not with 0.5.</w:t>
       </w:r>
     </w:p>
     <w:bookmarkEnd w:id="55"/>
@@ -5140,7 +5155,7 @@
               <w:pStyle w:val="Compact"/>
             </w:pPr>
             <w:r>
-              <w:t xml:space="preserve">0.401 (random gets 0.150)</w:t>
+              <w:t xml:space="preserve">0.401 (random gets 0.151)</w:t>
             </w:r>
           </w:p>
         </w:tc>
@@ -5912,7 +5927,7 @@
     </w:p>
     <w:bookmarkEnd w:id="67"/>
     <w:bookmarkEnd w:id="68"/>
-    <w:bookmarkStart w:id="79" w:name="X89299752c0d490518b28f94f4356fc6183c2bfc"/>
+    <w:bookmarkStart w:id="82" w:name="X89299752c0d490518b28f94f4356fc6183c2bfc"/>
     <w:p>
       <w:pPr>
         <w:pStyle w:val="Heading2"/>
@@ -6684,7 +6699,7 @@
       </w:r>
     </w:p>
     <w:bookmarkEnd w:id="76"/>
-    <w:bookmarkStart w:id="77" w:name="X4aa442267e708fa5af8a10d5b98600b2ea4eb40"/>
+    <w:bookmarkStart w:id="80" w:name="X4aa442267e708fa5af8a10d5b98600b2ea4eb40"/>
     <w:p>
       <w:pPr>
         <w:pStyle w:val="Heading3"/>
@@ -6698,11 +6713,64 @@
         <w:pStyle w:val="FirstParagraph"/>
       </w:pPr>
       <w:r>
-        <w:t xml:space="preserve">LIME explains the same prediction in a different way. It fits a small linear model around the commit using perturbed copies of it. Over 50 test commits, the two methods agreed on 60% of the top three features on average, with a mean Spearman rank correlation of 0.63. So they mostly agree on what matters but differ in the details. We use SHAP in the app because its values add up exactly to the prediction and it gives the same answer every time, while LIME depends on random sampling and on how it bins the features.</w:t>
-      </w:r>
-    </w:p>
-    <w:bookmarkEnd w:id="77"/>
-    <w:bookmarkStart w:id="78" w:name="X7d0673df8ddc6205b838956903ccca06feb34b0"/>
+        <w:t xml:space="preserve">LIME explains the same prediction in a different way. It fits a small linear model around the commit using perturbed copies of it. For the same commit as above, LIME also puts lines added far ahead of everything else:</w:t>
+      </w:r>
+    </w:p>
+    <w:p>
+      <w:pPr>
+        <w:pStyle w:val="BodyText"/>
+      </w:pPr>
+      <w:r>
+        <w:drawing>
+          <wp:inline>
+            <wp:extent cx="5334000" cy="2800349"/>
+            <wp:effectExtent b="0" l="0" r="0" t="0"/>
+            <wp:docPr descr="LIME explanation of the same commit" title="" id="78" name="Picture"/>
+            <a:graphic>
+              <a:graphicData uri="http://schemas.openxmlformats.org/drawingml/2006/picture">
+                <pic:pic>
+                  <pic:nvPicPr>
+                    <pic:cNvPr descr="../reports/figures/lime_85400d8d.png" id="79" name="Picture"/>
+                    <pic:cNvPicPr>
+                      <a:picLocks noChangeArrowheads="1" noChangeAspect="1"/>
+                    </pic:cNvPicPr>
+                  </pic:nvPicPr>
+                  <pic:blipFill>
+                    <a:blip r:embed="rId77"/>
+                    <a:stretch>
+                      <a:fillRect/>
+                    </a:stretch>
+                  </pic:blipFill>
+                  <pic:spPr bwMode="auto">
+                    <a:xfrm>
+                      <a:off x="0" y="0"/>
+                      <a:ext cx="5334000" cy="2800349"/>
+                    </a:xfrm>
+                    <a:prstGeom prst="rect">
+                      <a:avLst/>
+                    </a:prstGeom>
+                    <a:noFill/>
+                    <a:ln w="9525">
+                      <a:noFill/>
+                      <a:headEnd/>
+                      <a:tailEnd/>
+                    </a:ln>
+                  </pic:spPr>
+                </pic:pic>
+              </a:graphicData>
+            </a:graphic>
+          </wp:inline>
+        </w:drawing>
+      </w:r>
+      <w:r>
+        <w:t xml:space="preserve"> </w:t>
+      </w:r>
+      <w:r>
+        <w:t xml:space="preserve">Over 50 test commits, the two methods agreed on 60% of the top three features on average, with a mean Spearman rank correlation of 0.63. So they mostly agree on what matters but differ in the details. We use SHAP in the app because its values add up exactly to the prediction and it gives the same answer every time, while LIME depends on random sampling and on how it bins the features.</w:t>
+      </w:r>
+    </w:p>
+    <w:bookmarkEnd w:id="80"/>
+    <w:bookmarkStart w:id="81" w:name="X7d0673df8ddc6205b838956903ccca06feb34b0"/>
     <w:p>
       <w:pPr>
         <w:pStyle w:val="Heading3"/>
@@ -6779,9 +6847,9 @@
         <w:t xml:space="preserve">(0.97), carry almost the same information, so the linear model gave each pair large weights with opposite signs that cancel each other out. The accuracy was fine, but the explanations couldn't be trusted. The tuned XGBoost model uses shallow trees and samples columns, and it doesn't learn any of these reversals. The takeaway is that good accuracy doesn't guarantee good explanations. You have to check that the explanations make sense too.</w:t>
       </w:r>
     </w:p>
-    <w:bookmarkEnd w:id="78"/>
-    <w:bookmarkEnd w:id="79"/>
-    <w:bookmarkStart w:id="95" w:name="X7527940be29c91c107858810fc894120e2223d5"/>
+    <w:bookmarkEnd w:id="81"/>
+    <w:bookmarkEnd w:id="82"/>
+    <w:bookmarkStart w:id="101" w:name="X7527940be29c91c107858810fc894120e2223d5"/>
     <w:p>
       <w:pPr>
         <w:pStyle w:val="Heading2"/>
@@ -6837,18 +6905,18 @@
           <wp:inline>
             <wp:extent cx="5334000" cy="3704166"/>
             <wp:effectExtent b="0" l="0" r="0" t="0"/>
-            <wp:docPr descr="Overview page" title="" id="81" name="Picture"/>
+            <wp:docPr descr="Overview page" title="" id="84" name="Picture"/>
             <a:graphic>
               <a:graphicData uri="http://schemas.openxmlformats.org/drawingml/2006/picture">
                 <pic:pic>
                   <pic:nvPicPr>
-                    <pic:cNvPr descr="screenshots/overview.png" id="82" name="Picture"/>
+                    <pic:cNvPr descr="screenshots/overview.png" id="85" name="Picture"/>
                     <pic:cNvPicPr>
                       <a:picLocks noChangeArrowheads="1" noChangeAspect="1"/>
                     </pic:cNvPicPr>
                   </pic:nvPicPr>
                   <pic:blipFill>
-                    <a:blip r:embed="rId80"/>
+                    <a:blip r:embed="rId83"/>
                     <a:stretch>
                       <a:fillRect/>
                     </a:stretch>
@@ -6902,18 +6970,18 @@
           <wp:inline>
             <wp:extent cx="5334000" cy="4259791"/>
             <wp:effectExtent b="0" l="0" r="0" t="0"/>
-            <wp:docPr descr="Leaderboard page" title="" id="84" name="Picture"/>
+            <wp:docPr descr="Leaderboard page" title="" id="87" name="Picture"/>
             <a:graphic>
               <a:graphicData uri="http://schemas.openxmlformats.org/drawingml/2006/picture">
                 <pic:pic>
                   <pic:nvPicPr>
-                    <pic:cNvPr descr="screenshots/leaderboard.png" id="85" name="Picture"/>
+                    <pic:cNvPr descr="screenshots/leaderboard.png" id="88" name="Picture"/>
                     <pic:cNvPicPr>
                       <a:picLocks noChangeArrowheads="1" noChangeAspect="1"/>
                     </pic:cNvPicPr>
                   </pic:nvPicPr>
                   <pic:blipFill>
-                    <a:blip r:embed="rId83"/>
+                    <a:blip r:embed="rId86"/>
                     <a:stretch>
                       <a:fillRect/>
                     </a:stretch>
@@ -6967,18 +7035,18 @@
           <wp:inline>
             <wp:extent cx="5334000" cy="5556250"/>
             <wp:effectExtent b="0" l="0" r="0" t="0"/>
-            <wp:docPr descr="Explain page" title="" id="87" name="Picture"/>
+            <wp:docPr descr="Explain page" title="" id="90" name="Picture"/>
             <a:graphic>
               <a:graphicData uri="http://schemas.openxmlformats.org/drawingml/2006/picture">
                 <pic:pic>
                   <pic:nvPicPr>
-                    <pic:cNvPr descr="screenshots/explain.png" id="88" name="Picture"/>
+                    <pic:cNvPr descr="screenshots/explain.png" id="91" name="Picture"/>
                     <pic:cNvPicPr>
                       <a:picLocks noChangeArrowheads="1" noChangeAspect="1"/>
                     </pic:cNvPicPr>
                   </pic:nvPicPr>
                   <pic:blipFill>
-                    <a:blip r:embed="rId86"/>
+                    <a:blip r:embed="rId89"/>
                     <a:stretch>
                       <a:fillRect/>
                     </a:stretch>
@@ -7032,18 +7100,18 @@
           <wp:inline>
             <wp:extent cx="5334000" cy="4259791"/>
             <wp:effectExtent b="0" l="0" r="0" t="0"/>
-            <wp:docPr descr="What-if page" title="" id="90" name="Picture"/>
+            <wp:docPr descr="What-if page" title="" id="93" name="Picture"/>
             <a:graphic>
               <a:graphicData uri="http://schemas.openxmlformats.org/drawingml/2006/picture">
                 <pic:pic>
                   <pic:nvPicPr>
-                    <pic:cNvPr descr="screenshots/what-if.png" id="91" name="Picture"/>
+                    <pic:cNvPr descr="screenshots/what-if.png" id="94" name="Picture"/>
                     <pic:cNvPicPr>
                       <a:picLocks noChangeArrowheads="1" noChangeAspect="1"/>
                     </pic:cNvPicPr>
                   </pic:nvPicPr>
                   <pic:blipFill>
-                    <a:blip r:embed="rId89"/>
+                    <a:blip r:embed="rId92"/>
                     <a:stretch>
                       <a:fillRect/>
                     </a:stretch>
@@ -7097,7 +7165,54 @@
         <w:t xml:space="preserve">requests</w:t>
       </w:r>
       <w:r>
-        <w:t xml:space="preserve">.</w:t>
+        <w:t xml:space="preserve">. The example below scores the newest change to the library's source code.</w:t>
+      </w:r>
+    </w:p>
+    <w:p>
+      <w:pPr>
+        <w:pStyle w:val="BodyText"/>
+      </w:pPr>
+      <w:r>
+        <w:drawing>
+          <wp:inline>
+            <wp:extent cx="5334000" cy="5556250"/>
+            <wp:effectExtent b="0" l="0" r="0" t="0"/>
+            <wp:docPr descr="Score a local commit" title="" id="96" name="Picture"/>
+            <a:graphic>
+              <a:graphicData uri="http://schemas.openxmlformats.org/drawingml/2006/picture">
+                <pic:pic>
+                  <pic:nvPicPr>
+                    <pic:cNvPr descr="screenshots/score.png" id="97" name="Picture"/>
+                    <pic:cNvPicPr>
+                      <a:picLocks noChangeArrowheads="1" noChangeAspect="1"/>
+                    </pic:cNvPicPr>
+                  </pic:nvPicPr>
+                  <pic:blipFill>
+                    <a:blip r:embed="rId95"/>
+                    <a:stretch>
+                      <a:fillRect/>
+                    </a:stretch>
+                  </pic:blipFill>
+                  <pic:spPr bwMode="auto">
+                    <a:xfrm>
+                      <a:off x="0" y="0"/>
+                      <a:ext cx="5334000" cy="5556250"/>
+                    </a:xfrm>
+                    <a:prstGeom prst="rect">
+                      <a:avLst/>
+                    </a:prstGeom>
+                    <a:noFill/>
+                    <a:ln w="9525">
+                      <a:noFill/>
+                      <a:headEnd/>
+                      <a:tailEnd/>
+                    </a:ln>
+                  </pic:spPr>
+                </pic:pic>
+              </a:graphicData>
+            </a:graphic>
+          </wp:inline>
+        </w:drawing>
       </w:r>
     </w:p>
     <w:p>
@@ -7127,18 +7242,18 @@
           <wp:inline>
             <wp:extent cx="5334000" cy="4074583"/>
             <wp:effectExtent b="0" l="0" r="0" t="0"/>
-            <wp:docPr descr="Global explanations page" title="" id="93" name="Picture"/>
+            <wp:docPr descr="Global explanations page" title="" id="99" name="Picture"/>
             <a:graphic>
               <a:graphicData uri="http://schemas.openxmlformats.org/drawingml/2006/picture">
                 <pic:pic>
                   <pic:nvPicPr>
-                    <pic:cNvPr descr="screenshots/global.png" id="94" name="Picture"/>
+                    <pic:cNvPr descr="screenshots/global.png" id="100" name="Picture"/>
                     <pic:cNvPicPr>
                       <a:picLocks noChangeArrowheads="1" noChangeAspect="1"/>
                     </pic:cNvPicPr>
                   </pic:nvPicPr>
                   <pic:blipFill>
-                    <a:blip r:embed="rId92"/>
+                    <a:blip r:embed="rId98"/>
                     <a:stretch>
                       <a:fillRect/>
                     </a:stretch>
@@ -7185,8 +7300,8 @@
         <w:t xml:space="preserve">.</w:t>
       </w:r>
     </w:p>
-    <w:bookmarkEnd w:id="95"/>
-    <w:bookmarkStart w:id="96" w:name="Xb84c47283310de9b40fce18804b341cf6d21ee3"/>
+    <w:bookmarkEnd w:id="101"/>
+    <w:bookmarkStart w:id="102" w:name="Xb84c47283310de9b40fce18804b341cf6d21ee3"/>
     <w:p>
       <w:pPr>
         <w:pStyle w:val="Heading2"/>
@@ -7318,7 +7433,7 @@
         <w:t xml:space="preserve"> </w:t>
       </w:r>
       <w:r>
-        <w:t xml:space="preserve">The test period's bug rate (15.0%) is different from the training period's (23.6%), and a threshold chosen on older data flags generously on newer data. A deployed model would need retraining and a new threshold from time to time.</w:t>
+        <w:t xml:space="preserve">The test period's bug rate (15.1%) is different from the training period's (23.6%), and a threshold chosen on older data flags generously on newer data. A deployed model would need retraining and a new threshold from time to time.</w:t>
       </w:r>
     </w:p>
     <w:p>
@@ -7343,8 +7458,8 @@
         <w:t xml:space="preserve">Their CV score is the best of 25 candidates. Nested cross-validation would remove that bias but takes five times longer.</w:t>
       </w:r>
     </w:p>
-    <w:bookmarkEnd w:id="96"/>
-    <w:bookmarkStart w:id="97" w:name="Xc37a9581daa099f59d354645867dc9a690e565e"/>
+    <w:bookmarkEnd w:id="102"/>
+    <w:bookmarkStart w:id="103" w:name="Xc37a9581daa099f59d354645867dc9a690e565e"/>
     <w:p>
       <w:pPr>
         <w:pStyle w:val="Heading2"/>
@@ -7429,8 +7544,8 @@
         <w:t xml:space="preserve">Make scoring incremental, so a git hook could score each new commit in under a second without replaying the whole history.</w:t>
       </w:r>
     </w:p>
-    <w:bookmarkEnd w:id="97"/>
-    <w:bookmarkStart w:id="98" w:name="references"/>
+    <w:bookmarkEnd w:id="103"/>
+    <w:bookmarkStart w:id="104" w:name="references"/>
     <w:p>
       <w:pPr>
         <w:pStyle w:val="Heading2"/>
@@ -7664,8 +7779,8 @@
         <w:t xml:space="preserve">, 2017.</w:t>
       </w:r>
     </w:p>
-    <w:bookmarkEnd w:id="98"/>
-    <w:bookmarkEnd w:id="99"/>
+    <w:bookmarkEnd w:id="104"/>
+    <w:bookmarkEnd w:id="105"/>
     <w:sectPr>
       <w:pgSz w:w="11906" w:h="16838"/>
       <w:pgMar w:top="1440" w:right="1300" w:bottom="1440" w:left="1300" w:header="720" w:footer="720" w:gutter="0"/>

</xml_diff>

<commit_message>
Link the live app from the README, report, slides and notes
</commit_message>
<xml_diff>
--- a/docs/Project_Report.docx
+++ b/docs/Project_Report.docx
@@ -2,7 +2,7 @@
 <file path=word/document.xml><?xml version="1.0" encoding="utf-8"?>
 <w:document xmlns:w="http://schemas.openxmlformats.org/wordprocessingml/2006/main" xmlns:m="http://schemas.openxmlformats.org/officeDocument/2006/math" xmlns:r="http://schemas.openxmlformats.org/officeDocument/2006/relationships" xmlns:o="urn:schemas-microsoft-com:office:office" xmlns:v="urn:schemas-microsoft-com:vml" xmlns:w10="urn:schemas-microsoft-com:office:word" xmlns:a="http://schemas.openxmlformats.org/drawingml/2006/main" xmlns:pic="http://schemas.openxmlformats.org/drawingml/2006/picture" xmlns:wp="http://schemas.openxmlformats.org/drawingml/2006/wordprocessingDrawing">
   <w:body>
-    <w:bookmarkStart w:id="105" w:name="X7c8a9173058198f46d66c8517304e0e9ddff43f"/>
+    <w:bookmarkStart w:id="106" w:name="X7c8a9173058198f46d66c8517304e0e9ddff43f"/>
     <w:p>
       <w:pPr>
         <w:pStyle w:val="Heading1"/>
@@ -6849,7 +6849,7 @@
     </w:p>
     <w:bookmarkEnd w:id="81"/>
     <w:bookmarkEnd w:id="82"/>
-    <w:bookmarkStart w:id="101" w:name="X7527940be29c91c107858810fc894120e2223d5"/>
+    <w:bookmarkStart w:id="102" w:name="X7527940be29c91c107858810fc894120e2223d5"/>
     <w:p>
       <w:pPr>
         <w:pStyle w:val="Heading2"/>
@@ -6863,7 +6863,21 @@
         <w:pStyle w:val="FirstParagraph"/>
       </w:pPr>
       <w:r>
-        <w:t xml:space="preserve">We built a Streamlit app so the model can actually be used. Start it with</w:t>
+        <w:t xml:space="preserve">We built a Streamlit app so the model can actually be used. It is live at</w:t>
+      </w:r>
+      <w:r>
+        <w:t xml:space="preserve"> </w:t>
+      </w:r>
+      <w:hyperlink r:id="rId83">
+        <w:r>
+          <w:rPr>
+            <w:rStyle w:val="Hyperlink"/>
+          </w:rPr>
+          <w:t xml:space="preserve">https://code-change-risk-predictor.streamlit.app</w:t>
+        </w:r>
+      </w:hyperlink>
+      <w:r>
+        <w:t xml:space="preserve">, and it can also be run locally with</w:t>
       </w:r>
       <w:r>
         <w:t xml:space="preserve"> </w:t>
@@ -6905,18 +6919,18 @@
           <wp:inline>
             <wp:extent cx="5334000" cy="3704166"/>
             <wp:effectExtent b="0" l="0" r="0" t="0"/>
-            <wp:docPr descr="Overview page" title="" id="84" name="Picture"/>
+            <wp:docPr descr="Overview page" title="" id="85" name="Picture"/>
             <a:graphic>
               <a:graphicData uri="http://schemas.openxmlformats.org/drawingml/2006/picture">
                 <pic:pic>
                   <pic:nvPicPr>
-                    <pic:cNvPr descr="screenshots/overview.png" id="85" name="Picture"/>
+                    <pic:cNvPr descr="screenshots/overview.png" id="86" name="Picture"/>
                     <pic:cNvPicPr>
                       <a:picLocks noChangeArrowheads="1" noChangeAspect="1"/>
                     </pic:cNvPicPr>
                   </pic:nvPicPr>
                   <pic:blipFill>
-                    <a:blip r:embed="rId83"/>
+                    <a:blip r:embed="rId84"/>
                     <a:stretch>
                       <a:fillRect/>
                     </a:stretch>
@@ -6970,18 +6984,18 @@
           <wp:inline>
             <wp:extent cx="5334000" cy="4259791"/>
             <wp:effectExtent b="0" l="0" r="0" t="0"/>
-            <wp:docPr descr="Leaderboard page" title="" id="87" name="Picture"/>
+            <wp:docPr descr="Leaderboard page" title="" id="88" name="Picture"/>
             <a:graphic>
               <a:graphicData uri="http://schemas.openxmlformats.org/drawingml/2006/picture">
                 <pic:pic>
                   <pic:nvPicPr>
-                    <pic:cNvPr descr="screenshots/leaderboard.png" id="88" name="Picture"/>
+                    <pic:cNvPr descr="screenshots/leaderboard.png" id="89" name="Picture"/>
                     <pic:cNvPicPr>
                       <a:picLocks noChangeArrowheads="1" noChangeAspect="1"/>
                     </pic:cNvPicPr>
                   </pic:nvPicPr>
                   <pic:blipFill>
-                    <a:blip r:embed="rId86"/>
+                    <a:blip r:embed="rId87"/>
                     <a:stretch>
                       <a:fillRect/>
                     </a:stretch>
@@ -7035,18 +7049,18 @@
           <wp:inline>
             <wp:extent cx="5334000" cy="5556250"/>
             <wp:effectExtent b="0" l="0" r="0" t="0"/>
-            <wp:docPr descr="Explain page" title="" id="90" name="Picture"/>
+            <wp:docPr descr="Explain page" title="" id="91" name="Picture"/>
             <a:graphic>
               <a:graphicData uri="http://schemas.openxmlformats.org/drawingml/2006/picture">
                 <pic:pic>
                   <pic:nvPicPr>
-                    <pic:cNvPr descr="screenshots/explain.png" id="91" name="Picture"/>
+                    <pic:cNvPr descr="screenshots/explain.png" id="92" name="Picture"/>
                     <pic:cNvPicPr>
                       <a:picLocks noChangeArrowheads="1" noChangeAspect="1"/>
                     </pic:cNvPicPr>
                   </pic:nvPicPr>
                   <pic:blipFill>
-                    <a:blip r:embed="rId89"/>
+                    <a:blip r:embed="rId90"/>
                     <a:stretch>
                       <a:fillRect/>
                     </a:stretch>
@@ -7100,18 +7114,18 @@
           <wp:inline>
             <wp:extent cx="5334000" cy="4259791"/>
             <wp:effectExtent b="0" l="0" r="0" t="0"/>
-            <wp:docPr descr="What-if page" title="" id="93" name="Picture"/>
+            <wp:docPr descr="What-if page" title="" id="94" name="Picture"/>
             <a:graphic>
               <a:graphicData uri="http://schemas.openxmlformats.org/drawingml/2006/picture">
                 <pic:pic>
                   <pic:nvPicPr>
-                    <pic:cNvPr descr="screenshots/what-if.png" id="94" name="Picture"/>
+                    <pic:cNvPr descr="screenshots/what-if.png" id="95" name="Picture"/>
                     <pic:cNvPicPr>
                       <a:picLocks noChangeArrowheads="1" noChangeAspect="1"/>
                     </pic:cNvPicPr>
                   </pic:nvPicPr>
                   <pic:blipFill>
-                    <a:blip r:embed="rId92"/>
+                    <a:blip r:embed="rId93"/>
                     <a:stretch>
                       <a:fillRect/>
                     </a:stretch>
@@ -7177,18 +7191,18 @@
           <wp:inline>
             <wp:extent cx="5334000" cy="5556250"/>
             <wp:effectExtent b="0" l="0" r="0" t="0"/>
-            <wp:docPr descr="Score a local commit" title="" id="96" name="Picture"/>
+            <wp:docPr descr="Score a local commit" title="" id="97" name="Picture"/>
             <a:graphic>
               <a:graphicData uri="http://schemas.openxmlformats.org/drawingml/2006/picture">
                 <pic:pic>
                   <pic:nvPicPr>
-                    <pic:cNvPr descr="screenshots/score.png" id="97" name="Picture"/>
+                    <pic:cNvPr descr="screenshots/score.png" id="98" name="Picture"/>
                     <pic:cNvPicPr>
                       <a:picLocks noChangeArrowheads="1" noChangeAspect="1"/>
                     </pic:cNvPicPr>
                   </pic:nvPicPr>
                   <pic:blipFill>
-                    <a:blip r:embed="rId95"/>
+                    <a:blip r:embed="rId96"/>
                     <a:stretch>
                       <a:fillRect/>
                     </a:stretch>
@@ -7242,18 +7256,18 @@
           <wp:inline>
             <wp:extent cx="5334000" cy="4074583"/>
             <wp:effectExtent b="0" l="0" r="0" t="0"/>
-            <wp:docPr descr="Global explanations page" title="" id="99" name="Picture"/>
+            <wp:docPr descr="Global explanations page" title="" id="100" name="Picture"/>
             <a:graphic>
               <a:graphicData uri="http://schemas.openxmlformats.org/drawingml/2006/picture">
                 <pic:pic>
                   <pic:nvPicPr>
-                    <pic:cNvPr descr="screenshots/global.png" id="100" name="Picture"/>
+                    <pic:cNvPr descr="screenshots/global.png" id="101" name="Picture"/>
                     <pic:cNvPicPr>
                       <a:picLocks noChangeArrowheads="1" noChangeAspect="1"/>
                     </pic:cNvPicPr>
                   </pic:nvPicPr>
                   <pic:blipFill>
-                    <a:blip r:embed="rId98"/>
+                    <a:blip r:embed="rId99"/>
                     <a:stretch>
                       <a:fillRect/>
                     </a:stretch>
@@ -7300,8 +7314,8 @@
         <w:t xml:space="preserve">.</w:t>
       </w:r>
     </w:p>
-    <w:bookmarkEnd w:id="101"/>
-    <w:bookmarkStart w:id="102" w:name="Xb84c47283310de9b40fce18804b341cf6d21ee3"/>
+    <w:bookmarkEnd w:id="102"/>
+    <w:bookmarkStart w:id="103" w:name="Xb84c47283310de9b40fce18804b341cf6d21ee3"/>
     <w:p>
       <w:pPr>
         <w:pStyle w:val="Heading2"/>
@@ -7458,8 +7472,8 @@
         <w:t xml:space="preserve">Their CV score is the best of 25 candidates. Nested cross-validation would remove that bias but takes five times longer.</w:t>
       </w:r>
     </w:p>
-    <w:bookmarkEnd w:id="102"/>
-    <w:bookmarkStart w:id="103" w:name="Xc37a9581daa099f59d354645867dc9a690e565e"/>
+    <w:bookmarkEnd w:id="103"/>
+    <w:bookmarkStart w:id="104" w:name="Xc37a9581daa099f59d354645867dc9a690e565e"/>
     <w:p>
       <w:pPr>
         <w:pStyle w:val="Heading2"/>
@@ -7544,8 +7558,8 @@
         <w:t xml:space="preserve">Make scoring incremental, so a git hook could score each new commit in under a second without replaying the whole history.</w:t>
       </w:r>
     </w:p>
-    <w:bookmarkEnd w:id="103"/>
-    <w:bookmarkStart w:id="104" w:name="references"/>
+    <w:bookmarkEnd w:id="104"/>
+    <w:bookmarkStart w:id="105" w:name="references"/>
     <w:p>
       <w:pPr>
         <w:pStyle w:val="Heading2"/>
@@ -7779,8 +7793,8 @@
         <w:t xml:space="preserve">, 2017.</w:t>
       </w:r>
     </w:p>
-    <w:bookmarkEnd w:id="104"/>
     <w:bookmarkEnd w:id="105"/>
+    <w:bookmarkEnd w:id="106"/>
     <w:sectPr>
       <w:pgSz w:w="11906" w:h="16838"/>
       <w:pgMar w:top="1440" w:right="1300" w:bottom="1440" w:left="1300" w:header="720" w:footer="720" w:gutter="0"/>

</xml_diff>